<commit_message>
Sync to upstream it-28 (SHA: 3ef8b6788d7ba09368ecce78a8017823b6917d74)
</commit_message>
<xml_diff>
--- a/PaymentPractices/Source/Payment Practices/src/Reports/Payment Practice by Period.docx
+++ b/PaymentPractices/Source/Payment Practices/src/Reports/Payment Practice by Period.docx
@@ -2391,10 +2391,42 @@
  
          < H e a d e r _ T y p e _ C a p t i o n > H e a d e r _ T y p e _ C a p t i o n < / H e a d e r _ T y p e _ C a p t i o n >   
+         < M e d i a n _ P a y m e n t _ T i m e > M e d i a n _ P a y m e n t _ T i m e < / M e d i a n _ P a y m e n t _ T i m e > + 
+         < M e d i a n _ P a y m e n t _ T i m e _ C a p t i o n > M e d i a n _ P a y m e n t _ T i m e _ C a p t i o n < / M e d i a n _ P a y m e n t _ T i m e _ C a p t i o n > + 
+         < M o d e _ P a y m e n t _ T i m e > M o d e _ P a y m e n t _ T i m e < / M o d e _ P a y m e n t _ T i m e > + 
+         < M o d e _ P a y m e n t _ T i m e _ C a p t i o n > M o d e _ P a y m e n t _ T i m e _ C a p t i o n < / M o d e _ P a y m e n t _ T i m e _ C a p t i o n > + 
+         < M o d e _ P a y m e n t _ T i m e _ M a x > M o d e _ P a y m e n t _ T i m e _ M a x < / M o d e _ P a y m e n t _ T i m e _ M a x > + 
+         < M o d e _ P a y m e n t _ T i m e _ M a x _ C a p t i o n > M o d e _ P a y m e n t _ T i m e _ M a x _ C a p t i o n < / M o d e _ P a y m e n t _ T i m e _ M a x _ C a p t i o n > + 
+         < M o d e _ P a y m e n t _ T i m e _ M i n > M o d e _ P a y m e n t _ T i m e _ M i n < / M o d e _ P a y m e n t _ T i m e _ M i n > + 
+         < M o d e _ P a y m e n t _ T i m e _ M i n _ C a p t i o n > M o d e _ P a y m e n t _ T i m e _ M i n _ C a p t i o n < / M o d e _ P a y m e n t _ T i m e _ M i n _ C a p t i o n > + 
          < P c t _ P a i d _ o n _ T i m e > P c t _ P a i d _ o n _ T i m e < / P c t _ P a i d _ o n _ T i m e >   
          < P c t _ P a i d _ o n _ T i m e _ C a p t i o n > P c t _ P a i d _ o n _ T i m e _ C a p t i o n < / P c t _ P a i d _ o n _ T i m e _ C a p t i o n >   
+         < P c t _ P e p p o l _ E n a b l e d > P c t _ P e p p o l _ E n a b l e d < / P c t _ P e p p o l _ E n a b l e d > + 
+         < P c t _ P e p p o l _ E n a b l e d _ C a p t i o n > P c t _ P e p p o l _ E n a b l e d _ C a p t i o n < / P c t _ P e p p o l _ E n a b l e d _ C a p t i o n > + 
+         < P c t _ S m a l l _ B u s i n e s s _ P a y m e n t s > P c t _ S m a l l _ B u s i n e s s _ P a y m e n t s < / P c t _ S m a l l _ B u s i n e s s _ P a y m e n t s > + 
+         < P c t _ S m a l l _ B u s i n e s s _ P a y m e n t s _ C a p t i o n > P c t _ S m a l l _ B u s i n e s s _ P a y m e n t s _ C a p t i o n < / P c t _ S m a l l _ B u s i n e s s _ P a y m e n t s _ C a p t i o n > + 
+         < P e r c e n t i l e _ 8 0 t h _ P a y m e n t _ T i m e > P e r c e n t i l e _ 8 0 t h _ P a y m e n t _ T i m e < / P e r c e n t i l e _ 8 0 t h _ P a y m e n t _ T i m e > + 
+         < P e r c e n t i l e _ 8 0 t h _ P a y m e n t _ T i m e _ C a p t i o n > P e r c e n t i l e _ 8 0 t h _ P a y m e n t _ T i m e _ C a p t i o n < / P e r c e n t i l e _ 8 0 t h _ P a y m e n t _ T i m e _ C a p t i o n > + 
+         < P e r c e n t i l e _ 9 5 t h _ P a y m e n t _ T i m e > P e r c e n t i l e _ 9 5 t h _ P a y m e n t _ T i m e < / P e r c e n t i l e _ 9 5 t h _ P a y m e n t _ T i m e > + 
+         < P e r c e n t i l e _ 9 5 t h _ P a y m e n t _ T i m e _ C a p t i o n > P e r c e n t i l e _ 9 5 t h _ P a y m e n t _ T i m e _ C a p t i o n < / P e r c e n t i l e _ 9 5 t h _ P a y m e n t _ T i m e _ C a p t i o n > + 
          < S t a r t i n g _ D a t e > S t a r t i n g _ D a t e < / S t a r t i n g _ D a t e >   
          < S t a r t i n g _ D a t e _ C a p t i o n > S t a r t i n g _ D a t e _ C a p t i o n < / S t a r t i n g _ D a t e _ C a p t i o n > @@ -2436,6 +2468,237 @@
              < L i n e _ S o u r c e _ T y p e > L i n e _ S o u r c e _ T y p e < / L i n e _ S o u r c e _ T y p e >   
              < L i n e _ S o u r c e _ T y p e _ C a p t i o n > L i n e _ S o u r c e _ T y p e _ C a p t i o n < / L i n e _ S o u r c e _ T y p e _ C a p t i o n > + 
+         < / P a y m e n t P r a c t i c e L i n e > + 
+     < / P a y m e n t P r a c t i c e H e a d e r > + 
+ < / N a v W o r d R e p o r t X m l P a r t > 
+</file>
+
+<file path=customXml/item4.xml>��< ? x m l   v e r s i o n = " 1 . 0 "   e n c o d i n g = " u t f - 1 6 " ? > + 
+ < N a v W o r d R e p o r t X m l P a r t   x m l n s = " u r n : m i c r o s o f t - d y n a m i c s - b u s i n e s s c e n t r a l / i n t e r n a l / e x t e n d e d / r e p o r t s / P a y m e n t _ P r a c t i c e / 6 8 5 / " > + 
+     < B C R e p o r t I n f o r m a t i o n > + 
+         < R e p o r t M e t a d a t a > + 
+             < E x t e n s i o n I d > E x t e n s i o n   I D < / E x t e n s i o n I d > + 
+             < E x t e n s i o n N a m e > E x t e n s i o n   N a m e < / E x t e n s i o n N a m e > + 
+             < E x t e n s i o n P u b l i s h e r > E x t e n s i o n   P u b l i s h e r < / E x t e n s i o n P u b l i s h e r > + 
+             < E x t e n s i o n V e r s i o n > E x t e n s i o n   V e r s i o n < / E x t e n s i o n V e r s i o n > + 
+             < R e p o r t I d > R e p o r t   I D < / R e p o r t I d > + 
+             < R e p o r t N a m e > R e p o r t   N a m e < / R e p o r t N a m e > + 
+             < A b o u t T h i s R e p o r t T i t l e > A b o u t   T h i s   R e p o r t   T i t l e < / A b o u t T h i s R e p o r t T i t l e > + 
+             < A b o u t T h i s R e p o r t T e x t > A b o u t   T h i s   R e p o r t   T e x t < / A b o u t T h i s R e p o r t T e x t > + 
+             < R e p o r t H e l p L i n k > R e p o r t   H e l p   L i n k < / R e p o r t H e l p L i n k > + 
+         < / R e p o r t M e t a d a t a > + 
+         < R e p o r t R e q u e s t > + 
+             < T e n a n t E n t r a I d > T e n a n t   E n t r a   I d < / T e n a n t E n t r a I d > + 
+             < E n v i r o n m e n t N a m e > E n v i r o n m e n t   N a m e < / E n v i r o n m e n t N a m e > + 
+             < E n v i r o n m e n t T y p e > E n v i r o n m e n t   T y p e < / E n v i r o n m e n t T y p e > + 
+             < C o m p a n y N a m e > C o m p a n y   N a m e < / C o m p a n y N a m e > + 
+             < C o m p a n y D i s p l a y N a m e > C o m p a n y   D i s p l a y   N a m e < / C o m p a n y D i s p l a y N a m e > + 
+             < C o m p a n y I d > C o m p a n y   I D < / C o m p a n y I d > + 
+             < U s e r N a m e > U s e r   N a m e < / U s e r N a m e > + 
+             < D a t e A n d T i m e > D a t e   a n d   T i m e < / D a t e A n d T i m e > + 
+             < L a n g u a g e > L a n g u a g e < / L a n g u a g e > + 
+             < F o r m a t R e g i o n > F o r m a t   R e g i o n < / F o r m a t R e g i o n > + 
+             < D a t e T i m e V a l u e s > + 
+                 < Y e a r > Y e a r < / Y e a r > + 
+                 < M o n t h N u m b e r > M o n t h   N u m b e r < / M o n t h N u m b e r > + 
+                 < D a y N u m b e r > D a y   N u m b e r < / D a y N u m b e r > + 
+                 < H o u r > H o u r < / H o u r > + 
+                 < M i n u t e > M i n u t e < / M i n u t e > + 
+             < / D a t e T i m e V a l u e s > + 
+         < / R e p o r t R e q u e s t > + 
+     < / B C R e p o r t I n f o r m a t i o n > + 
+     < T o o l t i p s > + 
+         < T o o l t i p   c o l u m n = " M o d e _ P a y m e n t _ T i m e "   E l e m e n t I d = " 1 6 6 1 8 9 9 5 7 5 " > + 
+             < T o o l t i p T e x t   l a n g = " e n - U S " > S p e c i f i e s   t h e   m o s t   f r e q u e n t l y   o c c u r r i n g   n u m b e r   o f   d a y s   t a k e n   t o   p a y   i n v o i c e s   d u r i n g   t h e   r e p o r t i n g   p e r i o d . < / T o o l t i p T e x t > + 
+         < / T o o l t i p > + 
+         < T o o l t i p   c o l u m n = " M o d e _ P a y m e n t _ T i m e _ M i n "   E l e m e n t I d = " 2 1 4 1 5 3 4 8 6 0 " > + 
+             < T o o l t i p T e x t   l a n g = " e n - U S " > S p e c i f i e s   t h e   l o w e s t   m o d e   p a y m e n t   t i m e ,   i n   d a y s ,   f o u n d   a c r o s s   a l l   v e n d o r s   i n   t h e   r e p o r t i n g   p e r i o d .   T h e   v a l u e   i s   c a l c u l a t e d   b y   d e t e r m i n i n g   t h e   m o d e   p a y m e n t   t i m e   f o r   e a c h   v e n d o r ,   w h i c h   i s   t h e   m o s t   f r e q u e n t l y   o c c u r r i n g   n u m b e r   o f   d a y s   t a k e n   t o   p a y   i n v o i c e s   f o r   t h a t   v e n d o r   d u r i n g   t h e   r e p o r t i n g   p e r i o d ,   a n d   t h e n   f i n d i n g   t h e   l o w e s t   v a l u e   a m o n g   t h o s e . < / T o o l t i p T e x t > + 
+         < / T o o l t i p > + 
+         < T o o l t i p   c o l u m n = " M o d e _ P a y m e n t _ T i m e _ M a x "   E l e m e n t I d = " 1 3 1 3 4 3 0 6 3 0 " > + 
+             < T o o l t i p T e x t   l a n g = " e n - U S " > S p e c i f i e s   t h e   h i g h e s t   m o d e   p a y m e n t   t i m e ,   i n   d a y s ,   f o u n d   a c r o s s   a l l   v e n d o r s   i n   t h e   r e p o r t i n g   p e r i o d .   T h e   v a l u e   i s   c a l c u l a t e d   b y   d e t e r m i n i n g   t h e   m o d e   p a y m e n t   t i m e   f o r   e a c h   v e n d o r ,   w h i c h   i s   t h e   m o s t   f r e q u e n t l y   o c c u r r i n g   n u m b e r   o f   d a y s   t a k e n   t o   p a y   i n v o i c e s   f o r   t h a t   v e n d o r   d u r i n g   t h e   r e p o r t i n g   p e r i o d ,   a n d   t h e n   f i n d i n g   t h e   h i g h e s t   v a l u e   a m o n g   t h o s e . < / T o o l t i p T e x t > + 
+         < / T o o l t i p > + 
+         < T o o l t i p   c o l u m n = " M e d i a n _ P a y m e n t _ T i m e "   E l e m e n t I d = " 1 8 0 6 6 0 6 2 0 0 " > + 
+             < T o o l t i p T e x t   l a n g = " e n - U S " > S p e c i f i e s   t h e   m e d i a n   n u m b e r   o f   d a y s   t a k e n   t o   p a y   i n v o i c e s   d u r i n g   t h e   r e p o r t i n g   p e r i o d . < / T o o l t i p T e x t > + 
+         < / T o o l t i p > + 
+         < T o o l t i p   c o l u m n = " P e r c e n t i l e _ 8 0 t h _ P a y m e n t _ T i m e "   E l e m e n t I d = " 1 6 7 3 9 3 2 2 1 4 " > + 
+             < T o o l t i p T e x t   l a n g = " e n - U S " > S p e c i f i e s   t h e   n u m b e r   o f   d a y s   w i t h i n   w h i c h   8 0   p e r c e n t   o f   i n v o i c e s   w e r e   p a i d   d u r i n g   t h e   r e p o r t i n g   p e r i o d . < / T o o l t i p T e x t > + 
+         < / T o o l t i p > + 
+         < T o o l t i p   c o l u m n = " P e r c e n t i l e _ 9 5 t h _ P a y m e n t _ T i m e "   E l e m e n t I d = " 1 2 5 0 4 4 9 0 6 2 " > + 
+             < T o o l t i p T e x t   l a n g = " e n - U S " > S p e c i f i e s   t h e   n u m b e r   o f   d a y s   w i t h i n   w h i c h   9 5   p e r c e n t   o f   i n v o i c e s   w e r e   p a i d   d u r i n g   t h e   r e p o r t i n g   p e r i o d . < / T o o l t i p T e x t > + 
+         < / T o o l t i p > + 
+         < T o o l t i p   c o l u m n = " P c t _ P e p p o l _ E n a b l e d "   E l e m e n t I d = " 2 3 7 2 7 4 6 6 3 " > + 
+             < T o o l t i p T e x t   l a n g = " e n - U S " > S p e c i f i e s   t h e   p e r c e n t a g e   o f   i n v o i c e s   t h a t   w e r e   P E P P O L   e n a b l e d .   A n   i n v o i c e   i s   c o n s i d e r e d   P E P P O L   e n a b l e d   i f   t h e   v e n d o r   h a s   a   G L N . < / T o o l t i p T e x t > + 
+         < / T o o l t i p > + 
+         < T o o l t i p   c o l u m n = " P c t _ S m a l l _ B u s i n e s s _ P a y m e n t s "   E l e m e n t I d = " 1 7 5 4 6 3 8 1 8 1 " > + 
+             < T o o l t i p T e x t   l a n g = " e n - U S " > S p e c i f i e s   t h e   v a l u e   o f   p a y m e n t s   m a d e   t o   s m a l l   b u s i n e s s   v e n d o r s   a s   a   p e r c e n t a g e   o f   t o t a l   p a y m e n t s   i n   t h e   r e p o r t i n g   p e r i o d ,   i n c l u d i n g   p a r t i a l   p a y m e n t s .   A   v e n d o r   i s   c l a s s i f i e d   a s   a   s m a l l   b u s i n e s s   b a s e d   o n   t h e   c o m p a n y   s i z e   c o d e   o n   t h e   v e n d o r   r e c o r d . < / T o o l t i p T e x t > + 
+         < / T o o l t i p > + 
+     < / T o o l t i p s > + 
+     < P a y m e n t P r a c t i c e H e a d e r   E l e m e n t T y p e = " D a t a I t e m "   E l e m e n t I d = " 1 6 0 3 5 9 9 5 8 1 " > + 
+         < A g g r e g a t i o n _ T y p e   E l e m e n t T y p e = " C o l u m n "   E l e m e n t I d = " 4 8 3 6 9 1 0 2 6 "   D a t a T y p e = " E n u m " > A g g r e g a t i o n _ T y p e < / A g g r e g a t i o n _ T y p e > + 
+         < A g g r e g a t i o n _ T y p e _ C a p t i o n   E l e m e n t T y p e = " C o l u m n "   E l e m e n t I d = " 7 3 3 0 6 2 2 0 9 "   D a t a T y p e = " S t r i n g " > A g g r e g a t i o n _ T y p e _ C a p t i o n < / A g g r e g a t i o n _ T y p e _ C a p t i o n > + 
+         < A v e r a g e _ A c t u a l _ P a y m e n t _ P e r i o d   E l e m e n t T y p e = " C o l u m n "   E l e m e n t I d = " 5 9 1 1 7 2 6 8 8 "   D a t a T y p e = " I n t e g e r " > A v e r a g e _ A c t u a l _ P a y m e n t _ P e r i o d < / A v e r a g e _ A c t u a l _ P a y m e n t _ P e r i o d > + 
+         < A v e r a g e _ A c t u a l _ P a y m e n t _ P e r i o d _ C a p t i o n   E l e m e n t T y p e = " C o l u m n "   E l e m e n t I d = " 6 3 8 9 8 0 0 9 7 "   D a t a T y p e = " S t r i n g " > A v e r a g e _ A c t u a l _ P a y m e n t _ P e r i o d _ C a p t i o n < / A v e r a g e _ A c t u a l _ P a y m e n t _ P e r i o d _ C a p t i o n > + 
+         < A v e r a g e _ A g r e e d _ P a y m e n t _ P e r i o d   E l e m e n t T y p e = " C o l u m n "   E l e m e n t I d = " 2 0 3 5 3 6 5 8 2 2 "   D a t a T y p e = " I n t e g e r " > A v e r a g e _ A g r e e d _ P a y m e n t _ P e r i o d < / A v e r a g e _ A g r e e d _ P a y m e n t _ P e r i o d > + 
+         < A v e r a g e _ A g r e e d _ P a y m e n t _ P e r i o d _ C a p t i o n   E l e m e n t T y p e = " C o l u m n "   E l e m e n t I d = " 1 0 9 5 4 5 4 6 7 3 "   D a t a T y p e = " S t r i n g " > A v e r a g e _ A g r e e d _ P a y m e n t _ P e r i o d _ C a p t i o n < / A v e r a g e _ A g r e e d _ P a y m e n t _ P e r i o d _ C a p t i o n > + 
+         < E n d i n g _ D a t e   E l e m e n t T y p e = " C o l u m n "   E l e m e n t I d = " 4 5 0 8 4 7 3 9 9 "   D a t a T y p e = " S t r i n g " > E n d i n g _ D a t e < / E n d i n g _ D a t e > + 
+         < E n d i n g _ D a t e _ C a p t i o n   E l e m e n t T y p e = " C o l u m n "   E l e m e n t I d = " 7 3 3 9 5 6 4 7 2 "   D a t a T y p e = " S t r i n g " > E n d i n g _ D a t e _ C a p t i o n < / E n d i n g _ D a t e _ C a p t i o n > + 
+         < H e a d e r _ C a p t i o n   E l e m e n t T y p e = " C o l u m n "   E l e m e n t I d = " 9 7 3 0 7 4 5 4 1 "   D a t a T y p e = " S t r i n g " > H e a d e r _ C a p t i o n < / H e a d e r _ C a p t i o n > + 
+         < H e a d e r _ N o   E l e m e n t T y p e = " C o l u m n "   E l e m e n t I d = " 1 0 7 1 0 5 1 7 5 6 "   D a t a T y p e = " I n t e g e r " > H e a d e r _ N o < / H e a d e r _ N o > + 
+         < H e a d e r _ T y p e   E l e m e n t T y p e = " C o l u m n "   E l e m e n t I d = " 1 7 4 0 5 3 9 2 0 3 "   D a t a T y p e = " E n u m " > H e a d e r _ T y p e < / H e a d e r _ T y p e > + 
+         < H e a d e r _ T y p e _ C a p t i o n   E l e m e n t T y p e = " C o l u m n "   E l e m e n t I d = " 7 1 7 0 5 7 5 5 6 "   D a t a T y p e = " S t r i n g " > H e a d e r _ T y p e _ C a p t i o n < / H e a d e r _ T y p e _ C a p t i o n > + 
+         < M e d i a n _ P a y m e n t _ T i m e   E l e m e n t T y p e = " C o l u m n "   E l e m e n t I d = " 1 8 0 6 6 0 6 2 0 0 "   D a t a T y p e = " D e c i m a l " > M e d i a n _ P a y m e n t _ T i m e < / M e d i a n _ P a y m e n t _ T i m e > + 
+         < M e d i a n _ P a y m e n t _ T i m e _ C a p t i o n   E l e m e n t T y p e = " C o l u m n "   E l e m e n t I d = " 1 8 6 0 0 9 7 4 7 9 "   D a t a T y p e = " S t r i n g " > M e d i a n _ P a y m e n t _ T i m e _ C a p t i o n < / M e d i a n _ P a y m e n t _ T i m e _ C a p t i o n > + 
+         < M o d e _ P a y m e n t _ T i m e   E l e m e n t T y p e = " C o l u m n "   E l e m e n t I d = " 1 6 6 1 8 9 9 5 7 5 "   D a t a T y p e = " I n t e g e r " > M o d e _ P a y m e n t _ T i m e < / M o d e _ P a y m e n t _ T i m e > + 
+         < M o d e _ P a y m e n t _ T i m e _ C a p t i o n   E l e m e n t T y p e = " C o l u m n "   E l e m e n t I d = " 9 0 5 1 5 9 2 0 8 "   D a t a T y p e = " S t r i n g " > M o d e _ P a y m e n t _ T i m e _ C a p t i o n < / M o d e _ P a y m e n t _ T i m e _ C a p t i o n > + 
+         < M o d e _ P a y m e n t _ T i m e _ M a x   E l e m e n t T y p e = " C o l u m n "   E l e m e n t I d = " 1 3 1 3 4 3 0 6 3 0 "   D a t a T y p e = " I n t e g e r " > M o d e _ P a y m e n t _ T i m e _ M a x < / M o d e _ P a y m e n t _ T i m e _ M a x > + 
+         < M o d e _ P a y m e n t _ T i m e _ M a x _ C a p t i o n   E l e m e n t T y p e = " C o l u m n "   E l e m e n t I d = " 2 0 4 6 3 9 9 2 2 1 "   D a t a T y p e = " S t r i n g " > M o d e _ P a y m e n t _ T i m e _ M a x _ C a p t i o n < / M o d e _ P a y m e n t _ T i m e _ M a x _ C a p t i o n > + 
+         < M o d e _ P a y m e n t _ T i m e _ M i n   E l e m e n t T y p e = " C o l u m n "   E l e m e n t I d = " 2 1 4 1 5 3 4 8 6 0 "   D a t a T y p e = " I n t e g e r " > M o d e _ P a y m e n t _ T i m e _ M i n < / M o d e _ P a y m e n t _ T i m e _ M i n > + 
+         < M o d e _ P a y m e n t _ T i m e _ M i n _ C a p t i o n   E l e m e n t T y p e = " C o l u m n "   E l e m e n t I d = " 3 0 5 5 7 6 2 6 1 "   D a t a T y p e = " S t r i n g " > M o d e _ P a y m e n t _ T i m e _ M i n _ C a p t i o n < / M o d e _ P a y m e n t _ T i m e _ M i n _ C a p t i o n > + 
+         < P c t _ P a i d _ o n _ T i m e   E l e m e n t T y p e = " C o l u m n "   E l e m e n t I d = " 5 5 5 8 9 3 6 9 9 "   D a t a T y p e = " D e c i m a l " > P c t _ P a i d _ o n _ T i m e < / P c t _ P a i d _ o n _ T i m e > + 
+         < P c t _ P a i d _ o n _ T i m e _ C a p t i o n   E l e m e n t T y p e = " C o l u m n "   E l e m e n t I d = " 1 6 8 9 4 0 0 1 7 2 "   D a t a T y p e = " S t r i n g " > P c t _ P a i d _ o n _ T i m e _ C a p t i o n < / P c t _ P a i d _ o n _ T i m e _ C a p t i o n > + 
+         < P c t _ P e p p o l _ E n a b l e d   E l e m e n t T y p e = " C o l u m n "   E l e m e n t I d = " 2 3 7 2 7 4 6 6 3 "   D a t a T y p e = " D e c i m a l " > P c t _ P e p p o l _ E n a b l e d < / P c t _ P e p p o l _ E n a b l e d > + 
+         < P c t _ P e p p o l _ E n a b l e d _ C a p t i o n   E l e m e n t T y p e = " C o l u m n "   E l e m e n t I d = " 1 4 2 8 9 2 7 2 4 0 "   D a t a T y p e = " S t r i n g " > P c t _ P e p p o l _ E n a b l e d _ C a p t i o n < / P c t _ P e p p o l _ E n a b l e d _ C a p t i o n > + 
+         < P c t _ S m a l l _ B u s i n e s s _ P a y m e n t s   E l e m e n t T y p e = " C o l u m n "   E l e m e n t I d = " 1 7 5 4 6 3 8 1 8 1 "   D a t a T y p e = " D e c i m a l " > P c t _ S m a l l _ B u s i n e s s _ P a y m e n t s < / P c t _ S m a l l _ B u s i n e s s _ P a y m e n t s > + 
+         < P c t _ S m a l l _ B u s i n e s s _ P a y m e n t s _ C a p t i o n   E l e m e n t T y p e = " C o l u m n "   E l e m e n t I d = " 3 7 7 4 5 1 3 7 2 "   D a t a T y p e = " S t r i n g " > P c t _ S m a l l _ B u s i n e s s _ P a y m e n t s _ C a p t i o n < / P c t _ S m a l l _ B u s i n e s s _ P a y m e n t s _ C a p t i o n > + 
+         < P e r c e n t i l e _ 8 0 t h _ P a y m e n t _ T i m e   E l e m e n t T y p e = " C o l u m n "   E l e m e n t I d = " 1 6 7 3 9 3 2 2 1 4 "   D a t a T y p e = " I n t e g e r " > P e r c e n t i l e _ 8 0 t h _ P a y m e n t _ T i m e < / P e r c e n t i l e _ 8 0 t h _ P a y m e n t _ T i m e > + 
+         < P e r c e n t i l e _ 8 0 t h _ P a y m e n t _ T i m e _ C a p t i o n   E l e m e n t T y p e = " C o l u m n "   E l e m e n t I d = " 4 4 6 0 6 1 0 8 3 "   D a t a T y p e = " S t r i n g " > P e r c e n t i l e _ 8 0 t h _ P a y m e n t _ T i m e _ C a p t i o n < / P e r c e n t i l e _ 8 0 t h _ P a y m e n t _ T i m e _ C a p t i o n > + 
+         < P e r c e n t i l e _ 9 5 t h _ P a y m e n t _ T i m e   E l e m e n t T y p e = " C o l u m n "   E l e m e n t I d = " 1 2 5 0 4 4 9 0 6 2 "   D a t a T y p e = " I n t e g e r " > P e r c e n t i l e _ 9 5 t h _ P a y m e n t _ T i m e < / P e r c e n t i l e _ 9 5 t h _ P a y m e n t _ T i m e > + 
+         < P e r c e n t i l e _ 9 5 t h _ P a y m e n t _ T i m e _ C a p t i o n   E l e m e n t T y p e = " C o l u m n "   E l e m e n t I d = " 1 7 5 3 4 2 8 2 9 7 "   D a t a T y p e = " S t r i n g " > P e r c e n t i l e _ 9 5 t h _ P a y m e n t _ T i m e _ C a p t i o n < / P e r c e n t i l e _ 9 5 t h _ P a y m e n t _ T i m e _ C a p t i o n > + 
+         < S t a r t i n g _ D a t e   E l e m e n t T y p e = " C o l u m n "   E l e m e n t I d = " 1 5 2 1 3 9 9 9 8 2 "   D a t a T y p e = " S t r i n g " > S t a r t i n g _ D a t e < / S t a r t i n g _ D a t e > + 
+         < S t a r t i n g _ D a t e _ C a p t i o n   E l e m e n t T y p e = " C o l u m n "   E l e m e n t I d = " 1 8 0 5 5 5 2 0 0 1 "   D a t a T y p e = " S t r i n g " > S t a r t i n g _ D a t e _ C a p t i o n < / S t a r t i n g _ D a t e _ C a p t i o n > + 
+         < P a y m e n t P r a c t i c e L i n e   E l e m e n t T y p e = " D a t a I t e m "   E l e m e n t I d = " 1 3 4 8 6 9 7 6 4 2 " > + 
+             < L i n e _ A v e r a g e _ A c t u a l _ P a y m e n t _ P e r i o d   E l e m e n t T y p e = " C o l u m n "   E l e m e n t I d = " 2 7 3 8 8 2 2 6 3 "   D a t a T y p e = " I n t e g e r " > L i n e _ A v e r a g e _ A c t u a l _ P a y m e n t _ P e r i o d < / L i n e _ A v e r a g e _ A c t u a l _ P a y m e n t _ P e r i o d > + 
+             < L i n e _ A v e r a g e _ A c t u a l _ P a y m e n t _ P e r i o d _ C a p t i o n   E l e m e n t T y p e = " C o l u m n "   E l e m e n t I d = " 1 0 9 3 9 3 3 4 4 8 "   D a t a T y p e = " S t r i n g " > L i n e _ A v e r a g e _ A c t u a l _ P a y m e n t _ P e r i o d _ C a p t i o n < / L i n e _ A v e r a g e _ A c t u a l _ P a y m e n t _ P e r i o d _ C a p t i o n > + 
+             < L i n e _ A v e r a g e _ A g r e e d _ P a y m e n t _ P e r i o d   E l e m e n t T y p e = " C o l u m n "   E l e m e n t I d = " 1 6 8 6 8 6 2 8 8 7 "   D a t a T y p e = " I n t e g e r " > L i n e _ A v e r a g e _ A g r e e d _ P a y m e n t _ P e r i o d < / L i n e _ A v e r a g e _ A g r e e d _ P a y m e n t _ P e r i o d > + 
+             < L i n e _ A v e r a g e _ A g r e e d _ P a y m e n t _ P e r i o d _ C a p t i o n   E l e m e n t T y p e = " C o l u m n "   E l e m e n t I d = " 1 7 8 2 5 6 7 6 0 6 "   D a t a T y p e = " S t r i n g " > L i n e _ A v e r a g e _ A g r e e d _ P a y m e n t _ P e r i o d _ C a p t i o n < / L i n e _ A v e r a g e _ A g r e e d _ P a y m e n t _ P e r i o d _ C a p t i o n > + 
+             < L i n e _ C o m p a n y _ S i z e _ C o d e   E l e m e n t T y p e = " C o l u m n "   E l e m e n t I d = " 1 7 0 4 8 8 0 9 4 9 "   D a t a T y p e = " C o d e " > L i n e _ C o m p a n y _ S i z e _ C o d e < / L i n e _ C o m p a n y _ S i z e _ C o d e > + 
+             < L i n e _ C o m p a n y _ S i z e _ C o d e _ C a p t i o n   E l e m e n t T y p e = " C o l u m n "   E l e m e n t I d = " 4 2 7 1 5 7 8 8 2 "   D a t a T y p e = " S t r i n g " > L i n e _ C o m p a n y _ S i z e _ C o d e _ C a p t i o n < / L i n e _ C o m p a n y _ S i z e _ C o d e _ C a p t i o n > + 
+             < L i n e _ P a y m e n t _ P e r i o d _ C o d e   E l e m e n t T y p e = " C o l u m n "   E l e m e n t I d = " 1 2 9 3 6 3 5 2 2 2 "   D a t a T y p e = " C o d e " > L i n e _ P a y m e n t _ P e r i o d _ C o d e < / L i n e _ P a y m e n t _ P e r i o d _ C o d e > + 
+             < L i n e _ P a y m e n t _ P e r i o d _ C o d e _ C a p t i o n   E l e m e n t T y p e = " C o l u m n "   E l e m e n t I d = " 7 8 4 8 9 1 7 0 5 "   D a t a T y p e = " S t r i n g " > L i n e _ P a y m e n t _ P e r i o d _ C o d e _ C a p t i o n < / L i n e _ P a y m e n t _ P e r i o d _ C o d e _ C a p t i o n > + 
+             < L i n e _ P a y m e n t _ P e r i o d _ D e s c r i p t i o n   E l e m e n t T y p e = " C o l u m n "   E l e m e n t I d = " 1 7 5 6 5 0 2 4 8 5 "   D a t a T y p e = " T e x t " > L i n e _ P a y m e n t _ P e r i o d _ D e s c r i p t i o n < / L i n e _ P a y m e n t _ P e r i o d _ D e s c r i p t i o n > + 
+             < L i n e _ P a y m e n t _ P e r i o d _ D e s c r i p t i o n _ C a p t i o n   E l e m e n t T y p e = " C o l u m n "   E l e m e n t I d = " 7 7 2 5 9 9 0 0 4 "   D a t a T y p e = " S t r i n g " > L i n e _ P a y m e n t _ P e r i o d _ D e s c r i p t i o n _ C a p t i o n < / L i n e _ P a y m e n t _ P e r i o d _ D e s c r i p t i o n _ C a p t i o n > + 
+             < L i n e _ P c t _ P a i d _ i n _ P e r i o d   E l e m e n t T y p e = " C o l u m n "   E l e m e n t I d = " 1 3 8 8 7 2 7 0 "   D a t a T y p e = " D e c i m a l " > L i n e _ P c t _ P a i d _ i n _ P e r i o d < / L i n e _ P c t _ P a i d _ i n _ P e r i o d > + 
+             < L i n e _ P c t _ P a i d _ i n _ P e r i o d _ C a p t i o n   E l e m e n t T y p e = " C o l u m n "   E l e m e n t I d = " 1 4 7 1 2 3 7 5 5 7 "   D a t a T y p e = " S t r i n g " > L i n e _ P c t _ P a i d _ i n _ P e r i o d _ C a p t i o n < / L i n e _ P c t _ P a i d _ i n _ P e r i o d _ C a p t i o n > + 
+             < L i n e _ P c t _ P a i d _ i n _ P e r i o d _ _ A m o u n t _   E l e m e n t T y p e = " C o l u m n "   E l e m e n t I d = " 1 6 3 3 6 2 5 8 9 7 "   D a t a T y p e = " D e c i m a l " > L i n e _ P c t _ P a i d _ i n _ P e r i o d _ _ A m o u n t _ < / L i n e _ P c t _ P a i d _ i n _ P e r i o d _ _ A m o u n t _ > + 
+             < L i n e _ P c t _ P a i d _ i n _ P e r i o d _ _ A m o u n t _ _ C a p t i o n   E l e m e n t T y p e = " C o l u m n "   E l e m e n t I d = " 3 9 2 3 8 6 0 0 "   D a t a T y p e = " S t r i n g " > L i n e _ P c t _ P a i d _ i n _ P e r i o d _ _ A m o u n t _ _ C a p t i o n < / L i n e _ P c t _ P a i d _ i n _ P e r i o d _ _ A m o u n t _ _ C a p t i o n > + 
+             < L i n e _ P c t _ P a i d _ o n _ T i m e   E l e m e n t T y p e = " C o l u m n "   E l e m e n t I d = " 5 9 2 1 9 7 3 2 "   D a t a T y p e = " D e c i m a l " > L i n e _ P c t _ P a i d _ o n _ T i m e < / L i n e _ P c t _ P a i d _ o n _ T i m e > + 
+             < L i n e _ P c t _ P a i d _ o n _ T i m e _ C a p t i o n   E l e m e n t T y p e = " C o l u m n "   E l e m e n t I d = " 7 9 9 6 6 4 2 2 7 "   D a t a T y p e = " S t r i n g " > L i n e _ P c t _ P a i d _ o n _ T i m e _ C a p t i o n < / L i n e _ P c t _ P a i d _ o n _ T i m e _ C a p t i o n > + 
+             < L i n e _ S o u r c e _ T y p e   E l e m e n t T y p e = " C o l u m n "   E l e m e n t I d = " 1 5 7 1 9 2 4 9 7 8 "   D a t a T y p e = " E n u m " > L i n e _ S o u r c e _ T y p e < / L i n e _ S o u r c e _ T y p e > + 
+             < L i n e _ S o u r c e _ T y p e _ C a p t i o n   E l e m e n t T y p e = " C o l u m n "   E l e m e n t I d = " 6 6 8 3 3 6 9 9 1 "   D a t a T y p e = " S t r i n g " > L i n e _ S o u r c e _ T y p e _ C a p t i o n < / L i n e _ S o u r c e _ T y p e _ C a p t i o n >   
          < / P a y m e n t P r a c t i c e L i n e >   

</xml_diff>